<commit_message>
chore: deploy update 2026-05-15
</commit_message>
<xml_diff>
--- a/Documents/01_RESUMEN_GERENCIAL.docx
+++ b/Documents/01_RESUMEN_GERENCIAL.docx
@@ -53,9 +53,6 @@
           <w:pPr>
             <w:pStyle w:val="TtuloTDC"/>
           </w:pPr>
-          <w:r>
-            <w:t>Table of Contents</w:t>
-          </w:r>
         </w:p>
         <w:p>
           <w:pPr>
@@ -1574,25 +1571,25 @@
         <w:pStyle w:val="Ttulo1"/>
       </w:pPr>
       <w:bookmarkStart w:id="0" w:name="nota-de-revisión"/>
-      <w:bookmarkStart w:id="1" w:name="resumen-ejecutivo"/>
-      <w:bookmarkStart w:id="2" w:name="_Toc229603075"/>
+      <w:bookmarkStart w:id="1" w:name="_Toc229603075"/>
+      <w:bookmarkStart w:id="2" w:name="resumen-ejecutivo"/>
       <w:bookmarkEnd w:id="0"/>
       <w:r>
         <w:lastRenderedPageBreak/>
         <w:t>1. RESUMEN EJECUTIVO</w:t>
       </w:r>
-      <w:bookmarkEnd w:id="2"/>
+      <w:bookmarkEnd w:id="1"/>
     </w:p>
     <w:p>
       <w:pPr>
         <w:pStyle w:val="Ttulo2"/>
       </w:pPr>
-      <w:bookmarkStart w:id="3" w:name="empresas-auditadas"/>
-      <w:bookmarkStart w:id="4" w:name="_Toc229603076"/>
+      <w:bookmarkStart w:id="3" w:name="_Toc229603076"/>
+      <w:bookmarkStart w:id="4" w:name="empresas-auditadas"/>
       <w:r>
         <w:t>1.1. Empresas auditadas</w:t>
       </w:r>
-      <w:bookmarkEnd w:id="4"/>
+      <w:bookmarkEnd w:id="3"/>
     </w:p>
     <w:tbl>
       <w:tblPr>
@@ -1926,13 +1923,13 @@
       <w:pPr>
         <w:pStyle w:val="Ttulo2"/>
       </w:pPr>
-      <w:bookmarkStart w:id="5" w:name="Xe82e551c7e5f788a25b8e4e71cf3ff0e2703d3f"/>
-      <w:bookmarkStart w:id="6" w:name="_Toc229603077"/>
-      <w:bookmarkEnd w:id="3"/>
+      <w:bookmarkStart w:id="5" w:name="_Toc229603077"/>
+      <w:bookmarkStart w:id="6" w:name="Xe82e551c7e5f788a25b8e4e71cf3ff0e2703d3f"/>
+      <w:bookmarkEnd w:id="4"/>
       <w:r>
         <w:t>1.2. Contingencia tributaria y laboral cuantificada</w:t>
       </w:r>
-      <w:bookmarkEnd w:id="6"/>
+      <w:bookmarkEnd w:id="5"/>
       <w:r>
         <w:t xml:space="preserve"> </w:t>
       </w:r>
@@ -2205,7 +2202,6 @@
               <w:pStyle w:val="Compact"/>
             </w:pPr>
             <w:r>
-              <w:lastRenderedPageBreak/>
               <w:t>Multa SUNAFIL — CTS mayo 2025 ausente</w:t>
             </w:r>
           </w:p>
@@ -2248,6 +2244,7 @@
               <w:pStyle w:val="Compact"/>
             </w:pPr>
             <w:r>
+              <w:lastRenderedPageBreak/>
               <w:t>Multa SUNAFIL — CTS mayo 2025 ausente</w:t>
             </w:r>
           </w:p>
@@ -2705,25 +2702,25 @@
       <w:pPr>
         <w:pStyle w:val="Ttulo1"/>
       </w:pPr>
-      <w:bookmarkStart w:id="7" w:name="cuadro-de-hallazgos-críticos"/>
-      <w:bookmarkStart w:id="8" w:name="_Toc229603078"/>
-      <w:bookmarkEnd w:id="1"/>
-      <w:bookmarkEnd w:id="5"/>
+      <w:bookmarkStart w:id="7" w:name="_Toc229603078"/>
+      <w:bookmarkStart w:id="8" w:name="cuadro-de-hallazgos-críticos"/>
+      <w:bookmarkEnd w:id="2"/>
+      <w:bookmarkEnd w:id="6"/>
       <w:r>
         <w:t>2. CUADRO DE HALLAZGOS CRÍTICOS</w:t>
       </w:r>
-      <w:bookmarkEnd w:id="8"/>
+      <w:bookmarkEnd w:id="7"/>
     </w:p>
     <w:p>
       <w:pPr>
         <w:pStyle w:val="Ttulo2"/>
       </w:pPr>
-      <w:bookmarkStart w:id="9" w:name="X81d43a9e1d7774795029b3b94e91e25e670ceaf"/>
-      <w:bookmarkStart w:id="10" w:name="_Toc229603079"/>
+      <w:bookmarkStart w:id="9" w:name="_Toc229603079"/>
+      <w:bookmarkStart w:id="10" w:name="X81d43a9e1d7774795029b3b94e91e25e670ceaf"/>
       <w:r>
         <w:t>2.1. Top hallazgos para acción inmediata (próximos 15 días) — revisado</w:t>
       </w:r>
-      <w:bookmarkEnd w:id="10"/>
+      <w:bookmarkEnd w:id="9"/>
       <w:r>
         <w:t xml:space="preserve"> </w:t>
       </w:r>
@@ -2943,7 +2940,7 @@
                 <w:b/>
                 <w:bCs/>
               </w:rPr>
-              <w:t xml:space="preserve">Patrimonio </w:t>
+              <w:t xml:space="preserve">Patrimonio neto NEGATIVO </w:t>
             </w:r>
             <w:r>
               <w:rPr>
@@ -2951,7 +2948,7 @@
                 <w:bCs/>
               </w:rPr>
               <w:lastRenderedPageBreak/>
-              <w:t>neto NEGATIVO −S/2.87M</w:t>
+              <w:t>−S/2.87M</w:t>
             </w:r>
             <w:r>
               <w:t xml:space="preserve"> → causal Art. 220 LGS (disolución obligatoria)</w:t>
@@ -2982,11 +2979,11 @@
               <w:pStyle w:val="Compact"/>
             </w:pPr>
             <w:r>
-              <w:t xml:space="preserve">Convocar </w:t>
+              <w:t xml:space="preserve">Convocar Junta extraordinaria </w:t>
             </w:r>
             <w:r>
               <w:lastRenderedPageBreak/>
-              <w:t>Junta extraordinaria + plan de capitalización</w:t>
+              <w:t>+ plan de capitalización</w:t>
             </w:r>
           </w:p>
         </w:tc>
@@ -3478,11 +3475,11 @@
               <w:pStyle w:val="Compact"/>
             </w:pPr>
             <w:r>
-              <w:t xml:space="preserve">9,809 </w:t>
+              <w:t xml:space="preserve">9,809 asientos con fecha </w:t>
             </w:r>
             <w:r>
               <w:lastRenderedPageBreak/>
-              <w:t>asientos con fecha FUTURA por S/1,182M — verificar legitimidad</w:t>
+              <w:t>FUTURA por S/1,182M — verificar legitimidad</w:t>
             </w:r>
           </w:p>
         </w:tc>
@@ -3516,14 +3513,14 @@
               <w:rPr>
                 <w:rStyle w:val="VerbatimChar"/>
               </w:rPr>
-              <w:t xml:space="preserve">WHERE </w:t>
+              <w:t xml:space="preserve">WHERE FechaAplicacion &gt; </w:t>
             </w:r>
             <w:r>
               <w:rPr>
                 <w:rStyle w:val="VerbatimChar"/>
               </w:rPr>
               <w:lastRenderedPageBreak/>
-              <w:t>FechaAplicacion &gt; GETDATE()</w:t>
+              <w:t>GETDATE()</w:t>
             </w:r>
             <w:r>
               <w:t xml:space="preserve"> en CMO</w:t>
@@ -3610,13 +3607,13 @@
       <w:pPr>
         <w:pStyle w:val="Ttulo2"/>
       </w:pPr>
-      <w:bookmarkStart w:id="11" w:name="estado-financiero-consolidado-ytd-2026"/>
-      <w:bookmarkStart w:id="12" w:name="_Toc229603080"/>
-      <w:bookmarkEnd w:id="9"/>
+      <w:bookmarkStart w:id="11" w:name="_Toc229603080"/>
+      <w:bookmarkStart w:id="12" w:name="estado-financiero-consolidado-ytd-2026"/>
+      <w:bookmarkEnd w:id="10"/>
       <w:r>
         <w:t>2.2. Estado financiero consolidado YTD 2026</w:t>
       </w:r>
-      <w:bookmarkEnd w:id="12"/>
+      <w:bookmarkEnd w:id="11"/>
     </w:p>
     <w:tbl>
       <w:tblPr>
@@ -4303,13 +4300,13 @@
       <w:pPr>
         <w:pStyle w:val="Ttulo2"/>
       </w:pPr>
-      <w:bookmarkStart w:id="13" w:name="Xad6be60a912d5dbaf4d667cfcb9ffb7edd80401"/>
-      <w:bookmarkStart w:id="14" w:name="_Toc229603081"/>
-      <w:bookmarkEnd w:id="11"/>
+      <w:bookmarkStart w:id="13" w:name="_Toc229603081"/>
+      <w:bookmarkStart w:id="14" w:name="Xad6be60a912d5dbaf4d667cfcb9ffb7edd80401"/>
+      <w:bookmarkEnd w:id="12"/>
       <w:r>
         <w:t xml:space="preserve">2.3. Patrimonio neto consolidado </w:t>
       </w:r>
-      <w:bookmarkEnd w:id="14"/>
+      <w:bookmarkEnd w:id="13"/>
     </w:p>
     <w:tbl>
       <w:tblPr>
@@ -4638,7 +4635,6 @@
               <w:pStyle w:val="Compact"/>
             </w:pPr>
             <w:r>
-              <w:lastRenderedPageBreak/>
               <w:t>MEDARQ</w:t>
             </w:r>
           </w:p>
@@ -4706,6 +4702,7 @@
         <w:pStyle w:val="Textodebloque"/>
       </w:pPr>
       <w:r>
+        <w:lastRenderedPageBreak/>
         <w:t xml:space="preserve">🔴 </w:t>
       </w:r>
       <w:r>
@@ -4723,13 +4720,13 @@
       <w:pPr>
         <w:pStyle w:val="Ttulo2"/>
       </w:pPr>
-      <w:bookmarkStart w:id="15" w:name="Xb2e765f68eb529f3f447ae68db4dc4b1094734e"/>
-      <w:bookmarkStart w:id="16" w:name="_Toc229603082"/>
-      <w:bookmarkEnd w:id="13"/>
-      <w:r>
-        <w:t>2.4. Hallazgos NUEVOS detectados en validación forense (N01–N07)</w:t>
-      </w:r>
-      <w:bookmarkEnd w:id="16"/>
+      <w:bookmarkStart w:id="15" w:name="_Toc229603082"/>
+      <w:bookmarkStart w:id="16" w:name="Xb2e765f68eb529f3f447ae68db4dc4b1094734e"/>
+      <w:bookmarkEnd w:id="14"/>
+      <w:r>
+        <w:t>2.4. Hallazgos detectados en validación forense (N01–N07)</w:t>
+      </w:r>
+      <w:bookmarkEnd w:id="15"/>
     </w:p>
     <w:tbl>
       <w:tblPr>
@@ -5211,11 +5208,7 @@
               <w:pStyle w:val="Compact"/>
             </w:pPr>
             <w:r>
-              <w:t xml:space="preserve">Compensar contra IGV por pagar S/195K — ahorro </w:t>
-            </w:r>
-            <w:r>
-              <w:lastRenderedPageBreak/>
-              <w:t>inmediato</w:t>
+              <w:t>Compensar contra IGV por pagar S/195K — ahorro inmediato</w:t>
             </w:r>
           </w:p>
         </w:tc>
@@ -5225,15 +5218,15 @@
       <w:pPr>
         <w:pStyle w:val="Ttulo1"/>
       </w:pPr>
-      <w:bookmarkStart w:id="17" w:name="X79efa2c1013fa59eca948ea339ab2c170038ca3"/>
-      <w:bookmarkStart w:id="18" w:name="_Toc229603083"/>
-      <w:bookmarkEnd w:id="7"/>
-      <w:bookmarkEnd w:id="15"/>
+      <w:bookmarkStart w:id="17" w:name="_Toc229603083"/>
+      <w:bookmarkStart w:id="18" w:name="X79efa2c1013fa59eca948ea339ab2c170038ca3"/>
+      <w:bookmarkEnd w:id="8"/>
+      <w:bookmarkEnd w:id="16"/>
       <w:r>
         <w:lastRenderedPageBreak/>
         <w:t>3. CONTROL INTERNO — CALIFICACIÓN POR COMPONENTE</w:t>
       </w:r>
-      <w:bookmarkEnd w:id="18"/>
+      <w:bookmarkEnd w:id="17"/>
     </w:p>
     <w:tbl>
       <w:tblPr>
@@ -5968,24 +5961,24 @@
       <w:pPr>
         <w:pStyle w:val="Ttulo1"/>
       </w:pPr>
-      <w:bookmarkStart w:id="19" w:name="plan-de-remediación-priorizado"/>
-      <w:bookmarkStart w:id="20" w:name="_Toc229603084"/>
-      <w:bookmarkEnd w:id="17"/>
+      <w:bookmarkStart w:id="19" w:name="_Toc229603084"/>
+      <w:bookmarkStart w:id="20" w:name="plan-de-remediación-priorizado"/>
+      <w:bookmarkEnd w:id="18"/>
       <w:r>
         <w:t>4. PLAN DE REMEDIACIÓN PRIORIZADO</w:t>
       </w:r>
-      <w:bookmarkEnd w:id="20"/>
+      <w:bookmarkEnd w:id="19"/>
     </w:p>
     <w:p>
       <w:pPr>
         <w:pStyle w:val="Ttulo2"/>
       </w:pPr>
-      <w:bookmarkStart w:id="21" w:name="fase-1-inmediato-0-15-días"/>
-      <w:bookmarkStart w:id="22" w:name="_Toc229603085"/>
+      <w:bookmarkStart w:id="21" w:name="_Toc229603085"/>
+      <w:bookmarkStart w:id="22" w:name="fase-1-inmediato-0-15-días"/>
       <w:r>
         <w:t>Fase 1 — Inmediato (0-15 días)</w:t>
       </w:r>
-      <w:bookmarkEnd w:id="22"/>
+      <w:bookmarkEnd w:id="21"/>
     </w:p>
     <w:tbl>
       <w:tblPr>
@@ -6083,24 +6076,19 @@
               <w:pStyle w:val="Compact"/>
             </w:pPr>
             <w:r>
-              <w:t xml:space="preserve">Identificar asiento contable origen del −S/13M BBVA MN (enero 2026) + conciliar con </w:t>
-            </w:r>
-            <w:r>
-              <w:lastRenderedPageBreak/>
-              <w:t>estado de cuenta</w:t>
-            </w:r>
-          </w:p>
-        </w:tc>
-        <w:tc>
-          <w:tcPr>
-            <w:tcW w:w="1980" w:type="dxa"/>
-          </w:tcPr>
-          <w:p>
-            <w:pPr>
-              <w:pStyle w:val="Compact"/>
-            </w:pPr>
-            <w:r>
-              <w:lastRenderedPageBreak/>
+              <w:t>Identificar asiento contable origen del −S/13M BBVA MN (enero 2026) + conciliar con estado de cuenta</w:t>
+            </w:r>
+          </w:p>
+        </w:tc>
+        <w:tc>
+          <w:tcPr>
+            <w:tcW w:w="1980" w:type="dxa"/>
+          </w:tcPr>
+          <w:p>
+            <w:pPr>
+              <w:pStyle w:val="Compact"/>
+            </w:pPr>
+            <w:r>
               <w:t>AMERICANA</w:t>
             </w:r>
           </w:p>
@@ -6147,19 +6135,28 @@
                 <w:b/>
                 <w:bCs/>
               </w:rPr>
-              <w:t>Convocar Junta extraordinaria — Patrimonio NEGATIVO Art. 220 LGS</w:t>
-            </w:r>
-          </w:p>
-        </w:tc>
-        <w:tc>
-          <w:tcPr>
-            <w:tcW w:w="1980" w:type="dxa"/>
-          </w:tcPr>
-          <w:p>
-            <w:pPr>
-              <w:pStyle w:val="Compact"/>
-            </w:pPr>
-            <w:r>
+              <w:t xml:space="preserve">Convocar Junta extraordinaria — </w:t>
+            </w:r>
+            <w:r>
+              <w:rPr>
+                <w:b/>
+                <w:bCs/>
+              </w:rPr>
+              <w:lastRenderedPageBreak/>
+              <w:t>Patrimonio NEGATIVO Art. 220 LGS</w:t>
+            </w:r>
+          </w:p>
+        </w:tc>
+        <w:tc>
+          <w:tcPr>
+            <w:tcW w:w="1980" w:type="dxa"/>
+          </w:tcPr>
+          <w:p>
+            <w:pPr>
+              <w:pStyle w:val="Compact"/>
+            </w:pPr>
+            <w:r>
+              <w:lastRenderedPageBreak/>
               <w:t>CMO</w:t>
             </w:r>
           </w:p>
@@ -6665,18 +6662,14 @@
                 <w:b/>
                 <w:bCs/>
               </w:rPr>
-              <w:t xml:space="preserve">Compensar Renta 3ª INTEGRAL a </w:t>
-            </w:r>
-            <w:r>
-              <w:rPr>
-                <w:b/>
-                <w:bCs/>
-              </w:rPr>
+              <w:t>Compensar Renta 3ª INTEGRAL a favor S/287K contra IGV</w:t>
+            </w:r>
+            <w:r>
+              <w:t xml:space="preserve"> — ahorro tributario </w:t>
+            </w:r>
+            <w:r>
               <w:lastRenderedPageBreak/>
-              <w:t>favor S/287K contra IGV</w:t>
-            </w:r>
-            <w:r>
-              <w:t xml:space="preserve"> — ahorro tributario inmediato</w:t>
+              <w:t>inmediato</w:t>
             </w:r>
           </w:p>
         </w:tc>
@@ -6768,13 +6761,13 @@
       <w:pPr>
         <w:pStyle w:val="Ttulo2"/>
       </w:pPr>
-      <w:bookmarkStart w:id="23" w:name="fase-2-urgente-15-60-días"/>
-      <w:bookmarkStart w:id="24" w:name="_Toc229603086"/>
-      <w:bookmarkEnd w:id="21"/>
+      <w:bookmarkStart w:id="23" w:name="_Toc229603086"/>
+      <w:bookmarkStart w:id="24" w:name="fase-2-urgente-15-60-días"/>
+      <w:bookmarkEnd w:id="22"/>
       <w:r>
         <w:t>Fase 2 — Urgente (15-60 días)</w:t>
       </w:r>
-      <w:bookmarkEnd w:id="24"/>
+      <w:bookmarkEnd w:id="23"/>
     </w:p>
     <w:tbl>
       <w:tblPr>
@@ -6999,13 +6992,13 @@
       <w:pPr>
         <w:pStyle w:val="Ttulo2"/>
       </w:pPr>
-      <w:bookmarkStart w:id="25" w:name="fase-3-estratégico-60-180-días"/>
-      <w:bookmarkStart w:id="26" w:name="_Toc229603087"/>
-      <w:bookmarkEnd w:id="23"/>
+      <w:bookmarkStart w:id="25" w:name="_Toc229603087"/>
+      <w:bookmarkStart w:id="26" w:name="fase-3-estratégico-60-180-días"/>
+      <w:bookmarkEnd w:id="24"/>
       <w:r>
         <w:t>Fase 3 — Estratégico (60-180 días)</w:t>
       </w:r>
-      <w:bookmarkEnd w:id="26"/>
+      <w:bookmarkEnd w:id="25"/>
     </w:p>
     <w:tbl>
       <w:tblPr>
@@ -7201,26 +7194,26 @@
       <w:pPr>
         <w:pStyle w:val="Ttulo1"/>
       </w:pPr>
-      <w:bookmarkStart w:id="27" w:name="recomendaciones-al-directorio"/>
-      <w:bookmarkStart w:id="28" w:name="_Toc229603088"/>
-      <w:bookmarkEnd w:id="19"/>
-      <w:bookmarkEnd w:id="25"/>
+      <w:bookmarkStart w:id="27" w:name="_Toc229603088"/>
+      <w:bookmarkStart w:id="28" w:name="recomendaciones-al-directorio"/>
+      <w:bookmarkEnd w:id="20"/>
+      <w:bookmarkEnd w:id="26"/>
       <w:r>
         <w:lastRenderedPageBreak/>
         <w:t>5. RECOMENDACIONES AL DIRECTORIO</w:t>
       </w:r>
-      <w:bookmarkEnd w:id="28"/>
+      <w:bookmarkEnd w:id="27"/>
     </w:p>
     <w:p>
       <w:pPr>
         <w:pStyle w:val="Ttulo2"/>
       </w:pPr>
-      <w:bookmarkStart w:id="29" w:name="aprobaciones-inmediatas"/>
-      <w:bookmarkStart w:id="30" w:name="_Toc229603089"/>
+      <w:bookmarkStart w:id="29" w:name="_Toc229603089"/>
+      <w:bookmarkStart w:id="30" w:name="aprobaciones-inmediatas"/>
       <w:r>
         <w:t>5.1. Aprobaciones inmediatas</w:t>
       </w:r>
-      <w:bookmarkEnd w:id="30"/>
+      <w:bookmarkEnd w:id="29"/>
     </w:p>
     <w:p>
       <w:pPr>
@@ -7300,13 +7293,13 @@
       <w:pPr>
         <w:pStyle w:val="Ttulo2"/>
       </w:pPr>
-      <w:bookmarkStart w:id="31" w:name="comité-de-remediación"/>
-      <w:bookmarkStart w:id="32" w:name="_Toc229603090"/>
-      <w:bookmarkEnd w:id="29"/>
+      <w:bookmarkStart w:id="31" w:name="_Toc229603090"/>
+      <w:bookmarkStart w:id="32" w:name="comité-de-remediación"/>
+      <w:bookmarkEnd w:id="30"/>
       <w:r>
         <w:t>5.2. Comité de Remediación</w:t>
       </w:r>
-      <w:bookmarkEnd w:id="32"/>
+      <w:bookmarkEnd w:id="31"/>
     </w:p>
     <w:p>
       <w:pPr>
@@ -7328,13 +7321,13 @@
       <w:pPr>
         <w:pStyle w:val="Ttulo2"/>
       </w:pPr>
-      <w:bookmarkStart w:id="33" w:name="reportes-al-directorio"/>
-      <w:bookmarkStart w:id="34" w:name="_Toc229603091"/>
-      <w:bookmarkEnd w:id="31"/>
+      <w:bookmarkStart w:id="33" w:name="_Toc229603091"/>
+      <w:bookmarkStart w:id="34" w:name="reportes-al-directorio"/>
+      <w:bookmarkEnd w:id="32"/>
       <w:r>
         <w:t>5.3. Reportes al Directorio</w:t>
       </w:r>
-      <w:bookmarkEnd w:id="34"/>
+      <w:bookmarkEnd w:id="33"/>
     </w:p>
     <w:p>
       <w:pPr>
@@ -7376,13 +7369,13 @@
       <w:pPr>
         <w:pStyle w:val="Ttulo2"/>
       </w:pPr>
-      <w:bookmarkStart w:id="35" w:name="compromiso-del-sistema"/>
-      <w:bookmarkStart w:id="36" w:name="_Toc229603092"/>
-      <w:bookmarkEnd w:id="33"/>
+      <w:bookmarkStart w:id="35" w:name="_Toc229603092"/>
+      <w:bookmarkStart w:id="36" w:name="compromiso-del-sistema"/>
+      <w:bookmarkEnd w:id="34"/>
       <w:r>
         <w:t>5.4. Compromiso del Sistema</w:t>
       </w:r>
-      <w:bookmarkEnd w:id="36"/>
+      <w:bookmarkEnd w:id="35"/>
     </w:p>
     <w:p>
       <w:pPr>
@@ -7536,36 +7529,17 @@
     </w:p>
     <w:p>
       <w:pPr>
-        <w:pStyle w:val="FirstParagraph"/>
-      </w:pPr>
-      <w:r>
-        <w:rPr>
-          <w:b/>
-          <w:bCs/>
-        </w:rPr>
-        <w:t xml:space="preserve">El sistema está listo para </w:t>
-      </w:r>
-      <w:r>
-        <w:rPr>
-          <w:b/>
-          <w:bCs/>
-        </w:rPr>
-        <w:t>auditoria.</w:t>
-      </w:r>
-    </w:p>
-    <w:p>
-      <w:pPr>
         <w:pStyle w:val="Ttulo1"/>
       </w:pPr>
-      <w:bookmarkStart w:id="37" w:name="conclusión-gerencial"/>
-      <w:bookmarkStart w:id="38" w:name="_Toc229603093"/>
-      <w:bookmarkEnd w:id="27"/>
-      <w:bookmarkEnd w:id="35"/>
+      <w:bookmarkStart w:id="37" w:name="_Toc229603093"/>
+      <w:bookmarkStart w:id="38" w:name="conclusión-gerencial"/>
+      <w:bookmarkEnd w:id="28"/>
+      <w:bookmarkEnd w:id="36"/>
       <w:r>
         <w:lastRenderedPageBreak/>
         <w:t>6. CONCLUSIÓN GERENCIAL</w:t>
       </w:r>
-      <w:bookmarkEnd w:id="38"/>
+      <w:bookmarkEnd w:id="37"/>
     </w:p>
     <w:p>
       <w:pPr>
@@ -7595,12 +7569,12 @@
       <w:pPr>
         <w:pStyle w:val="Ttulo2"/>
       </w:pPr>
-      <w:bookmarkStart w:id="39" w:name="lo-bueno-oportunidades-aprovechables"/>
-      <w:bookmarkStart w:id="40" w:name="_Toc229603094"/>
+      <w:bookmarkStart w:id="39" w:name="_Toc229603094"/>
+      <w:bookmarkStart w:id="40" w:name="lo-bueno-oportunidades-aprovechables"/>
       <w:r>
         <w:t>6.1. Lo bueno (oportunidades aprovechables)</w:t>
       </w:r>
-      <w:bookmarkEnd w:id="40"/>
+      <w:bookmarkEnd w:id="39"/>
     </w:p>
     <w:p>
       <w:pPr>
@@ -7716,13 +7690,13 @@
       <w:pPr>
         <w:pStyle w:val="Ttulo2"/>
       </w:pPr>
-      <w:bookmarkStart w:id="41" w:name="lo-malo-gaps-críticos"/>
-      <w:bookmarkStart w:id="42" w:name="_Toc229603095"/>
-      <w:bookmarkEnd w:id="39"/>
+      <w:bookmarkStart w:id="41" w:name="_Toc229603095"/>
+      <w:bookmarkStart w:id="42" w:name="lo-malo-gaps-críticos"/>
+      <w:bookmarkEnd w:id="40"/>
       <w:r>
         <w:t>6.2. Lo malo (gaps críticos)</w:t>
       </w:r>
-      <w:bookmarkEnd w:id="42"/>
+      <w:bookmarkEnd w:id="41"/>
     </w:p>
     <w:p>
       <w:pPr>
@@ -7838,13 +7812,13 @@
       <w:pPr>
         <w:pStyle w:val="Ttulo2"/>
       </w:pPr>
-      <w:bookmarkStart w:id="43" w:name="lo-urgente-próximos-15-días"/>
-      <w:bookmarkStart w:id="44" w:name="_Toc229603096"/>
-      <w:bookmarkEnd w:id="41"/>
+      <w:bookmarkStart w:id="43" w:name="_Toc229603096"/>
+      <w:bookmarkStart w:id="44" w:name="lo-urgente-próximos-15-días"/>
+      <w:bookmarkEnd w:id="42"/>
       <w:r>
         <w:t>6.3. Lo urgente (próximos 15 días)</w:t>
       </w:r>
-      <w:bookmarkEnd w:id="44"/>
+      <w:bookmarkEnd w:id="43"/>
     </w:p>
     <w:p>
       <w:pPr>
@@ -8122,8 +8096,8 @@
       <w:r>
         <w:t xml:space="preserve"> 11 de mayo de 2026</w:t>
       </w:r>
-      <w:bookmarkEnd w:id="37"/>
-      <w:bookmarkEnd w:id="43"/>
+      <w:bookmarkEnd w:id="38"/>
+      <w:bookmarkEnd w:id="44"/>
     </w:p>
     <w:sectPr>
       <w:footnotePr>

</xml_diff>